<commit_message>
Update resume: articles redirect to portfolio, no LinkedIn references
</commit_message>
<xml_diff>
--- a/Phanindra_Gaddam_Resume_2025.docx
+++ b/Phanindra_Gaddam_Resume_2025.docx
@@ -77,18 +77,9 @@
                 <w:sz w:val="18"/>
                 <w:szCs w:val="18"/>
               </w:rPr>
-              <w:t xml:space="preserve">Wayne, NJ  ·  </w:t>
-            </w:r>
-            <w:r>
-              <w:rPr>
-                <w:rFonts w:ascii="Calibri" w:cs="Calibri" w:eastAsia="Calibri" w:hAnsi="Calibri"/>
-                <w:color w:val="616161"/>
-                <w:sz w:val="18"/>
-                <w:szCs w:val="18"/>
-              </w:rPr>
-              <w:t xml:space="preserve">+1-907-351-7666  ·  </w:t>
-            </w:r>
-            <w:hyperlink w:history="1" r:id="rIdqazfp6suli0dbm1qwlxom">
+              <w:t xml:space="preserve">Wayne, NJ  ·  +1-907-351-7666  ·  </w:t>
+            </w:r>
+            <w:hyperlink w:history="1" r:id="rIdupqvp1u3aby4cmf8t8kug">
               <w:r>
                 <w:rPr>
                   <w:rFonts w:ascii="Calibri" w:cs="Calibri" w:eastAsia="Calibri" w:hAnsi="Calibri"/>
@@ -109,7 +100,7 @@
               </w:rPr>
               <w:t xml:space="preserve">  ·  </w:t>
             </w:r>
-            <w:hyperlink w:history="1" r:id="rIdqnvrltcupi6x88t6tc3zc">
+            <w:hyperlink w:history="1" r:id="rIdzcpyormzg9nn378yxjzeq">
               <w:r>
                 <w:rPr>
                   <w:rFonts w:ascii="Calibri" w:cs="Calibri" w:eastAsia="Calibri" w:hAnsi="Calibri"/>
@@ -130,7 +121,7 @@
               </w:rPr>
               <w:t xml:space="preserve">  ·  </w:t>
             </w:r>
-            <w:hyperlink w:history="1" r:id="rIdu4-jfjvzlh12rfhsaocn-">
+            <w:hyperlink w:history="1" r:id="rId-umne2dvqhyzozxc1l80b">
               <w:r>
                 <w:rPr>
                   <w:rFonts w:ascii="Calibri" w:cs="Calibri" w:eastAsia="Calibri" w:hAnsi="Calibri"/>
@@ -539,7 +530,7 @@
           <w:sz w:val="20"/>
           <w:szCs w:val="20"/>
         </w:rPr>
-        <w:t xml:space="preserve"> connectivity. Known for solving complex performance issues, designing persona-based BI architectures, and ensuring reliability for executive-critical reporting.</w:t>
+        <w:t xml:space="preserve"> connectivity.</w:t>
       </w:r>
     </w:p>
     <w:p>
@@ -593,28 +584,7 @@
           <w:sz w:val="20"/>
           <w:szCs w:val="20"/>
         </w:rPr>
-        <w:t xml:space="preserve"> enterprise deployment guide on GitHub (</w:t>
-      </w:r>
-      <w:hyperlink w:history="1" r:id="rIdzoghtpbr78-lfa7j3ehgd">
-        <w:r>
-          <w:rPr>
-            <w:rFonts w:ascii="Calibri" w:cs="Calibri" w:eastAsia="Calibri" w:hAnsi="Calibri"/>
-            <w:color w:val="2E75B6"/>
-            <w:sz w:val="20"/>
-            <w:szCs w:val="20"/>
-            <w:u w:val="single"/>
-          </w:rPr>
-          <w:t xml:space="preserve">github.com/phang7/Portfolio</w:t>
-        </w:r>
-      </w:hyperlink>
-      <w:r>
-        <w:rPr>
-          <w:rFonts w:ascii="Calibri" w:cs="Calibri" w:eastAsia="Calibri" w:hAnsi="Calibri"/>
-          <w:color w:val="212121"/>
-          <w:sz w:val="20"/>
-          <w:szCs w:val="20"/>
-        </w:rPr>
-        <w:t xml:space="preserve">). Author of a </w:t>
+        <w:t xml:space="preserve"> enterprise deployment guide and a </w:t>
       </w:r>
       <w:r>
         <w:rPr>
@@ -625,18 +595,18 @@
           <w:sz w:val="20"/>
           <w:szCs w:val="20"/>
         </w:rPr>
-        <w:t xml:space="preserve">LinkedIn thought leadership series</w:t>
-      </w:r>
-      <w:r>
-        <w:rPr>
-          <w:rFonts w:ascii="Calibri" w:cs="Calibri" w:eastAsia="Calibri" w:hAnsi="Calibri"/>
-          <w:color w:val="212121"/>
-          <w:sz w:val="20"/>
-          <w:szCs w:val="20"/>
-        </w:rPr>
-        <w:t xml:space="preserve"> on Fabric architecture, governance, and performance optimisation. Portfolio: </w:t>
-      </w:r>
-      <w:hyperlink w:history="1" r:id="rIdqacjbw22rh1rat2qd1rhv">
+        <w:t xml:space="preserve">six-article technical series</w:t>
+      </w:r>
+      <w:r>
+        <w:rPr>
+          <w:rFonts w:ascii="Calibri" w:cs="Calibri" w:eastAsia="Calibri" w:hAnsi="Calibri"/>
+          <w:color w:val="212121"/>
+          <w:sz w:val="20"/>
+          <w:szCs w:val="20"/>
+        </w:rPr>
+        <w:t xml:space="preserve"> covering Fabric architecture, governance, performance optimisation, and Direct Lake strategy. All available at </w:t>
+      </w:r>
+      <w:hyperlink w:history="1" r:id="rIdlhh3w3tqlcgim9jxgmp3p">
         <w:r>
           <w:rPr>
             <w:rFonts w:ascii="Calibri" w:cs="Calibri" w:eastAsia="Calibri" w:hAnsi="Calibri"/>
@@ -1061,7 +1031,7 @@
                 <w:sz w:val="19"/>
                 <w:szCs w:val="19"/>
               </w:rPr>
-              <w:t xml:space="preserve">SAP BusinessObjects XI 3.1 · BI 4.0 / 4.2 · CMC (Central Management Console) · LCM (Lifecycle Manager) · IDT (Information Design Tool) · Universe Design · AD / LDAP Integration · Security Architecture · Upgrade Programs (3.x → 4.2)</w:t>
+              <w:t xml:space="preserve">SAP BusinessObjects XI 3.1 · BI 4.0 / 4.2 · CMC · LCM · IDT Universe Design · AD / LDAP Integration · Security Architecture · Upgrade Programs (3.x → 4.2)</w:t>
             </w:r>
           </w:p>
         </w:tc>
@@ -1239,7 +1209,7 @@
                 <w:sz w:val="19"/>
                 <w:szCs w:val="19"/>
               </w:rPr>
-              <w:t xml:space="preserve">SCQA Storytelling · Executive Communication · Roadmap Creation · Persona-Based BI Design · Stakeholder Advisory · AI &amp; Copilot Enablement · Thought Leadership</w:t>
+              <w:t xml:space="preserve">SCQA Storytelling · Executive Communication · Roadmap Creation · Persona-Based BI Design · Stakeholder Advisory · AI &amp; Copilot Enablement</w:t>
             </w:r>
           </w:p>
         </w:tc>
@@ -1667,7 +1637,7 @@
           <w:sz w:val="20"/>
           <w:szCs w:val="20"/>
         </w:rPr>
-        <w:t xml:space="preserve"> (Bronze / Silver / Gold), Delta Lake structures, and Lakehouse modelling standards on </w:t>
+        <w:t xml:space="preserve"> (Bronze / Silver / Gold), Delta Lake structures, and Lakehouse modelling on </w:t>
       </w:r>
       <w:r>
         <w:rPr>
@@ -1864,7 +1834,7 @@
           <w:sz w:val="20"/>
           <w:szCs w:val="20"/>
         </w:rPr>
-        <w:t xml:space="preserve">Designed and managed gateway clusters, high-availability configurations, and automated monitoring for mission-critical refresh workloads — achieving </w:t>
+        <w:t xml:space="preserve">Designed and managed gateway clusters, high-availability configurations, and automated monitoring — achieving </w:t>
       </w:r>
       <w:r>
         <w:rPr>
@@ -1944,7 +1914,7 @@
           <w:sz w:val="19"/>
           <w:szCs w:val="19"/>
         </w:rPr>
-        <w:t xml:space="preserve">Automation &amp; Platform Engineering</w:t>
+        <w:t xml:space="preserve">Automation, Performance &amp; Platform Engineering</w:t>
       </w:r>
     </w:p>
     <w:p>
@@ -2022,48 +1992,7 @@
           <w:sz w:val="20"/>
           <w:szCs w:val="20"/>
         </w:rPr>
-        <w:t xml:space="preserve"> — an open-source Fabric tenant monitoring solution — and published a comprehensive enterprise deployment guide on GitHub as a </w:t>
-      </w:r>
-      <w:r>
-        <w:rPr>
-          <w:rFonts w:ascii="Calibri" w:cs="Calibri" w:eastAsia="Calibri" w:hAnsi="Calibri"/>
-          <w:b/>
-          <w:bCs/>
-          <w:color w:val="212121"/>
-          <w:sz w:val="20"/>
-          <w:szCs w:val="20"/>
-        </w:rPr>
-        <w:t xml:space="preserve">community contribution</w:t>
-      </w:r>
-      <w:r>
-        <w:rPr>
-          <w:rFonts w:ascii="Calibri" w:cs="Calibri" w:eastAsia="Calibri" w:hAnsi="Calibri"/>
-          <w:color w:val="212121"/>
-          <w:sz w:val="20"/>
-          <w:szCs w:val="20"/>
-        </w:rPr>
-        <w:t xml:space="preserve">. Guide available at: </w:t>
-      </w:r>
-      <w:hyperlink w:history="1" r:id="rId5slhy2htpm4uge3xqyf4i">
-        <w:r>
-          <w:rPr>
-            <w:rFonts w:ascii="Calibri" w:cs="Calibri" w:eastAsia="Calibri" w:hAnsi="Calibri"/>
-            <w:color w:val="2E75B6"/>
-            <w:sz w:val="20"/>
-            <w:szCs w:val="20"/>
-            <w:u w:val="single"/>
-          </w:rPr>
-          <w:t xml:space="preserve">github.com/phang7/Portfolio</w:t>
-        </w:r>
-      </w:hyperlink>
-      <w:r>
-        <w:rPr>
-          <w:rFonts w:ascii="Calibri" w:cs="Calibri" w:eastAsia="Calibri" w:hAnsi="Calibri"/>
-          <w:color w:val="212121"/>
-          <w:sz w:val="20"/>
-          <w:szCs w:val="20"/>
-        </w:rPr>
-        <w:t xml:space="preserve">.</w:t>
+        <w:t xml:space="preserve"> and published an enterprise deployment guide as an open-source community contribution — see portfolio for details.</w:t>
       </w:r>
     </w:p>
     <w:p>
@@ -2082,28 +2011,27 @@
           <w:sz w:val="20"/>
           <w:szCs w:val="20"/>
         </w:rPr>
-        <w:t xml:space="preserve">Developed reusable admin scripts, monitoring dashboards, and automation templates that reduced manual overhead and improved platform reliability across the estate.</w:t>
-      </w:r>
-    </w:p>
-    <w:p>
-      <w:pPr>
-        <w:spacing w:after="0" w:before="40"/>
-      </w:pPr>
-    </w:p>
-    <w:p>
-      <w:pPr>
-        <w:spacing w:after="20" w:before="0"/>
-      </w:pPr>
+        <w:t xml:space="preserve">Eliminated throttling and performance bottlenecks through semantic model tuning, incremental refresh redesign, caching strategies, and capacity-aware design — </w:t>
+      </w:r>
       <w:r>
         <w:rPr>
           <w:rFonts w:ascii="Calibri" w:cs="Calibri" w:eastAsia="Calibri" w:hAnsi="Calibri"/>
           <w:b/>
           <w:bCs/>
-          <w:color w:val="1F4E79"/>
-          <w:sz w:val="19"/>
-          <w:szCs w:val="19"/>
-        </w:rPr>
-        <w:t xml:space="preserve">Performance Optimisation &amp; Executive Reporting</w:t>
+          <w:color w:val="212121"/>
+          <w:sz w:val="20"/>
+          <w:szCs w:val="20"/>
+        </w:rPr>
+        <w:t xml:space="preserve">reducing refresh times by ~55% and CU consumption by ~40%</w:t>
+      </w:r>
+      <w:r>
+        <w:rPr>
+          <w:rFonts w:ascii="Calibri" w:cs="Calibri" w:eastAsia="Calibri" w:hAnsi="Calibri"/>
+          <w:color w:val="212121"/>
+          <w:sz w:val="20"/>
+          <w:szCs w:val="20"/>
+        </w:rPr>
+        <w:t xml:space="preserve"> at peak periods.</w:t>
       </w:r>
     </w:p>
     <w:p>
@@ -2142,7 +2070,28 @@
           <w:sz w:val="20"/>
           <w:szCs w:val="20"/>
         </w:rPr>
-        <w:t xml:space="preserve"> — separating executive dashboards (Import, pre-aggregated, &lt;2s load), operational analytics (Direct Lake), and self-service layers (Lakehouse SQL endpoint) to eliminate workload contention.</w:t>
+        <w:t xml:space="preserve"> — separating executive dashboards (Import, pre-aggregated), operational analytics (Direct Lake), and self-service layers (Lakehouse SQL endpoint) to eliminate workload contention.</w:t>
+      </w:r>
+    </w:p>
+    <w:p>
+      <w:pPr>
+        <w:spacing w:after="0" w:before="40"/>
+      </w:pPr>
+    </w:p>
+    <w:p>
+      <w:pPr>
+        <w:spacing w:after="20" w:before="0"/>
+      </w:pPr>
+      <w:r>
+        <w:rPr>
+          <w:rFonts w:ascii="Calibri" w:cs="Calibri" w:eastAsia="Calibri" w:hAnsi="Calibri"/>
+          <w:b/>
+          <w:bCs/>
+          <w:color w:val="1F4E79"/>
+          <w:sz w:val="19"/>
+          <w:szCs w:val="19"/>
+        </w:rPr>
+        <w:t xml:space="preserve">Cross-Functional Leadership</w:t>
       </w:r>
     </w:p>
     <w:p>
@@ -2161,27 +2110,7 @@
           <w:sz w:val="20"/>
           <w:szCs w:val="20"/>
         </w:rPr>
-        <w:t xml:space="preserve">Eliminated throttling and performance bottlenecks through semantic model tuning, incremental refresh redesign, caching strategies, and capacity-aware design — </w:t>
-      </w:r>
-      <w:r>
-        <w:rPr>
-          <w:rFonts w:ascii="Calibri" w:cs="Calibri" w:eastAsia="Calibri" w:hAnsi="Calibri"/>
-          <w:b/>
-          <w:bCs/>
-          <w:color w:val="212121"/>
-          <w:sz w:val="20"/>
-          <w:szCs w:val="20"/>
-        </w:rPr>
-        <w:t xml:space="preserve">reducing average refresh times by ~55% and CU consumption by ~40%</w:t>
-      </w:r>
-      <w:r>
-        <w:rPr>
-          <w:rFonts w:ascii="Calibri" w:cs="Calibri" w:eastAsia="Calibri" w:hAnsi="Calibri"/>
-          <w:color w:val="212121"/>
-          <w:sz w:val="20"/>
-          <w:szCs w:val="20"/>
-        </w:rPr>
-        <w:t xml:space="preserve"> at peak periods.</w:t>
+        <w:t xml:space="preserve">Served as primary BI advisor to IT leadership — guiding Fabric adoption, capacity planning, governance, and modernisation strategy.</w:t>
       </w:r>
     </w:p>
     <w:p>
@@ -2196,67 +2125,8 @@
       <w:r>
         <w:rPr>
           <w:rFonts w:ascii="Calibri" w:cs="Calibri" w:eastAsia="Calibri" w:hAnsi="Calibri"/>
-          <w:color w:val="212121"/>
-          <w:sz w:val="20"/>
-          <w:szCs w:val="20"/>
-        </w:rPr>
-        <w:t xml:space="preserve">Ensured zero-downtime reliability for executive-critical reporting through pre-staging, materialised views, dedicated capacity tiering, and optimised refresh orchestration.</w:t>
-      </w:r>
-    </w:p>
-    <w:p>
-      <w:pPr>
-        <w:spacing w:after="0" w:before="40"/>
-      </w:pPr>
-    </w:p>
-    <w:p>
-      <w:pPr>
-        <w:spacing w:after="20" w:before="0"/>
-      </w:pPr>
-      <w:r>
-        <w:rPr>
-          <w:rFonts w:ascii="Calibri" w:cs="Calibri" w:eastAsia="Calibri" w:hAnsi="Calibri"/>
           <w:b/>
           <w:bCs/>
-          <w:color w:val="1F4E79"/>
-          <w:sz w:val="19"/>
-          <w:szCs w:val="19"/>
-        </w:rPr>
-        <w:t xml:space="preserve">Cross-Functional Leadership &amp; Thought Leadership</w:t>
-      </w:r>
-    </w:p>
-    <w:p>
-      <w:pPr>
-        <w:pStyle w:val="ListParagraph"/>
-        <w:numPr>
-          <w:ilvl w:val="0"/>
-          <w:numId w:val="2"/>
-        </w:numPr>
-        <w:spacing w:after="30" w:before="30"/>
-      </w:pPr>
-      <w:r>
-        <w:rPr>
-          <w:rFonts w:ascii="Calibri" w:cs="Calibri" w:eastAsia="Calibri" w:hAnsi="Calibri"/>
-          <w:color w:val="212121"/>
-          <w:sz w:val="20"/>
-          <w:szCs w:val="20"/>
-        </w:rPr>
-        <w:t xml:space="preserve">Served as primary BI advisor to IT leadership — guiding Fabric adoption, capacity planning, governance, and modernisation strategy across the enterprise.</w:t>
-      </w:r>
-    </w:p>
-    <w:p>
-      <w:pPr>
-        <w:pStyle w:val="ListParagraph"/>
-        <w:numPr>
-          <w:ilvl w:val="0"/>
-          <w:numId w:val="2"/>
-        </w:numPr>
-        <w:spacing w:after="30" w:before="30"/>
-      </w:pPr>
-      <w:r>
-        <w:rPr>
-          <w:rFonts w:ascii="Calibri" w:cs="Calibri" w:eastAsia="Calibri" w:hAnsi="Calibri"/>
-          <w:b/>
-          <w:bCs/>
           <w:color w:val="212121"/>
           <w:sz w:val="20"/>
           <w:szCs w:val="20"/>
@@ -2271,66 +2141,6 @@
           <w:szCs w:val="20"/>
         </w:rPr>
         <w:t xml:space="preserve"> on Power BI, Microsoft Fabric, Databricks, and self-service best practices.</w:t>
-      </w:r>
-    </w:p>
-    <w:p>
-      <w:pPr>
-        <w:pStyle w:val="ListParagraph"/>
-        <w:numPr>
-          <w:ilvl w:val="0"/>
-          <w:numId w:val="2"/>
-        </w:numPr>
-        <w:spacing w:after="30" w:before="30"/>
-      </w:pPr>
-      <w:r>
-        <w:rPr>
-          <w:rFonts w:ascii="Calibri" w:cs="Calibri" w:eastAsia="Calibri" w:hAnsi="Calibri"/>
-          <w:color w:val="212121"/>
-          <w:sz w:val="20"/>
-          <w:szCs w:val="20"/>
-        </w:rPr>
-        <w:t xml:space="preserve">Publishing a </w:t>
-      </w:r>
-      <w:r>
-        <w:rPr>
-          <w:rFonts w:ascii="Calibri" w:cs="Calibri" w:eastAsia="Calibri" w:hAnsi="Calibri"/>
-          <w:b/>
-          <w:bCs/>
-          <w:color w:val="212121"/>
-          <w:sz w:val="20"/>
-          <w:szCs w:val="20"/>
-        </w:rPr>
-        <w:t xml:space="preserve">LinkedIn thought leadership series</w:t>
-      </w:r>
-      <w:r>
-        <w:rPr>
-          <w:rFonts w:ascii="Calibri" w:cs="Calibri" w:eastAsia="Calibri" w:hAnsi="Calibri"/>
-          <w:color w:val="212121"/>
-          <w:sz w:val="20"/>
-          <w:szCs w:val="20"/>
-        </w:rPr>
-        <w:t xml:space="preserve"> on enterprise Fabric architecture, governance frameworks, performance optimisation, and Direct Lake strategy — portfolio at </w:t>
-      </w:r>
-      <w:hyperlink w:history="1" r:id="rIdzqc9nyqd8id-kbxhg2eqa">
-        <w:r>
-          <w:rPr>
-            <w:rFonts w:ascii="Calibri" w:cs="Calibri" w:eastAsia="Calibri" w:hAnsi="Calibri"/>
-            <w:color w:val="2E75B6"/>
-            <w:sz w:val="20"/>
-            <w:szCs w:val="20"/>
-            <w:u w:val="single"/>
-          </w:rPr>
-          <w:t xml:space="preserve">phang7.github.io/Portfolio</w:t>
-        </w:r>
-      </w:hyperlink>
-      <w:r>
-        <w:rPr>
-          <w:rFonts w:ascii="Calibri" w:cs="Calibri" w:eastAsia="Calibri" w:hAnsi="Calibri"/>
-          <w:color w:val="212121"/>
-          <w:sz w:val="20"/>
-          <w:szCs w:val="20"/>
-        </w:rPr>
-        <w:t xml:space="preserve">.</w:t>
       </w:r>
     </w:p>
     <w:p>
@@ -2512,7 +2322,7 @@
           <w:sz w:val="20"/>
           <w:szCs w:val="20"/>
         </w:rPr>
-        <w:t xml:space="preserve">Modernised legacy BI platform by designing Power BI semantic models with </w:t>
+        <w:t xml:space="preserve">Modernised legacy BI platform with </w:t>
       </w:r>
       <w:r>
         <w:rPr>
@@ -2551,7 +2361,7 @@
           <w:sz w:val="20"/>
           <w:szCs w:val="20"/>
         </w:rPr>
-        <w:t xml:space="preserve">Created scalable dashboards supporting strategic decision-making across multiple business units. Led UAT cycles, iterative refinements, and stakeholder alignment.</w:t>
+        <w:t xml:space="preserve">Led UAT cycles, iterative refinements, and stakeholder alignment across multiple business units.</w:t>
       </w:r>
     </w:p>
     <w:p>
@@ -2791,7 +2601,7 @@
           <w:sz w:val="20"/>
           <w:szCs w:val="20"/>
         </w:rPr>
-        <w:t xml:space="preserve">Automated SLA compliance dashboards using SCCM data; administered Power BI servers and supported enterprise BI operations across a 3-year engagement.</w:t>
+        <w:t xml:space="preserve">Automated SLA compliance dashboards using SCCM data across a 3-year engagement.</w:t>
       </w:r>
     </w:p>
     <w:p>
@@ -2993,7 +2803,7 @@
           <w:sz w:val="20"/>
           <w:szCs w:val="20"/>
         </w:rPr>
-        <w:t xml:space="preserve"> for major enterprises across pharmaceutical, healthcare, and energy sectors — universe design, security migration, WebI and Xcelsius dashboard development.</w:t>
+        <w:t xml:space="preserve"> for major enterprises across pharmaceutical, healthcare, and energy sectors.</w:t>
       </w:r>
     </w:p>
     <w:p>
@@ -3031,7 +2841,7 @@
           <w:sz w:val="20"/>
           <w:szCs w:val="20"/>
         </w:rPr>
-        <w:t xml:space="preserve">Managed offshore delivery teams, UAT cycles, and enterprise reporting transitions to Power BI for multiple clients.</w:t>
+        <w:t xml:space="preserve">Managed offshore delivery teams, UAT cycles, and enterprise reporting transitions to Power BI.</w:t>
       </w:r>
     </w:p>
     <w:p>
@@ -3086,7 +2896,7 @@
                 <w:sz w:val="20"/>
                 <w:szCs w:val="20"/>
               </w:rPr>
-              <w:t xml:space="preserve">COMMUNITY CONTRIBUTIONS &amp; THOUGHT LEADERSHIP</w:t>
+              <w:t xml:space="preserve">PORTFOLIO, CONTRIBUTIONS &amp; THOUGHT LEADERSHIP</w:t>
             </w:r>
           </w:p>
         </w:tc>
@@ -3143,7 +2953,7 @@
                 <w:sz w:val="20"/>
                 <w:szCs w:val="20"/>
               </w:rPr>
-              <w:t xml:space="preserve">FUAM Enterprise Deployment Guide</w:t>
+              <w:t xml:space="preserve">Portfolio Website</w:t>
             </w:r>
             <w:r>
               <w:rPr>
@@ -3152,9 +2962,9 @@
                 <w:sz w:val="20"/>
                 <w:szCs w:val="20"/>
               </w:rPr>
-              <w:t xml:space="preserve">  ·  Open Source Community Contribution  ·  </w:t>
-            </w:r>
-            <w:hyperlink w:history="1" r:id="rIdiigs9wvmcicmdwfr73xkl">
+              <w:t xml:space="preserve">  ·  </w:t>
+            </w:r>
+            <w:hyperlink w:history="1" r:id="rIdy4egd7pcb1lrerffaevwa">
               <w:r>
                 <w:rPr>
                   <w:rFonts w:ascii="Calibri" w:cs="Calibri" w:eastAsia="Calibri" w:hAnsi="Calibri"/>
@@ -3163,7 +2973,7 @@
                   <w:szCs w:val="20"/>
                   <w:u w:val="single"/>
                 </w:rPr>
-                <w:t xml:space="preserve">github.com/phang7/Portfolio</w:t>
+                <w:t xml:space="preserve">phang7.github.io/Portfolio</w:t>
               </w:r>
             </w:hyperlink>
           </w:p>
@@ -3178,7 +2988,7 @@
                 <w:sz w:val="19"/>
                 <w:szCs w:val="19"/>
               </w:rPr>
-              <w:t xml:space="preserve">Authored and published a comprehensive enterprise deployment guide for FUAM (Fabric Unified Admin Monitoring) — an open-source Microsoft Fabric tenant monitoring solution. The guide covers Service Principal setup, pipeline orchestration, Azure Key Vault integration, governance configuration, and scheduling. Publicly available on GitHub.</w:t>
+              <w:t xml:space="preserve">Full professional portfolio including project case studies, skills, career timeline, and 6 in-depth technical articles on Fabric architecture, governance, performance optimisation, DAX modelling, Direct Lake strategy, and FUAM deployment. All content readable directly on-site — no external links required.</w:t>
             </w:r>
           </w:p>
         </w:tc>
@@ -3235,7 +3045,7 @@
                 <w:sz w:val="20"/>
                 <w:szCs w:val="20"/>
               </w:rPr>
-              <w:t xml:space="preserve">LinkedIn Article Series — Power BI &amp; Fabric Architecture</w:t>
+              <w:t xml:space="preserve">FUAM Enterprise Deployment Guide  ·  Open Source Community Contribution</w:t>
             </w:r>
             <w:r>
               <w:rPr>
@@ -3244,9 +3054,9 @@
                 <w:sz w:val="20"/>
                 <w:szCs w:val="20"/>
               </w:rPr>
-              <w:t xml:space="preserve">  ·  6 articles  ·  </w:t>
-            </w:r>
-            <w:hyperlink w:history="1" r:id="rIdimfqoqyjswqzq_rmv4qgl">
+              <w:t xml:space="preserve">  ·  </w:t>
+            </w:r>
+            <w:hyperlink w:history="1" r:id="rIdi0ml5k4ksa1if39be7nyl">
               <w:r>
                 <w:rPr>
                   <w:rFonts w:ascii="Calibri" w:cs="Calibri" w:eastAsia="Calibri" w:hAnsi="Calibri"/>
@@ -3255,7 +3065,7 @@
                   <w:szCs w:val="20"/>
                   <w:u w:val="single"/>
                 </w:rPr>
-                <w:t xml:space="preserve">linkedin.com/in/phanindra-gaddam-0886b153</w:t>
+                <w:t xml:space="preserve">Available at portfolio</w:t>
               </w:r>
             </w:hyperlink>
           </w:p>
@@ -3270,7 +3080,99 @@
                 <w:sz w:val="19"/>
                 <w:szCs w:val="19"/>
               </w:rPr>
-              <w:t xml:space="preserve">Publishing a series of practitioner-level thought leadership articles drawn from 13 years of enterprise BI architecture experience: Why Most Fabric Migrations Fail · Zero Throttling at Scale · The Governance Framework That Scaled Across 100+ Workspaces · Persona-Based BI Architecture · Direct Lake vs Import vs Live Connect · FUAM Deployment Guide.</w:t>
+              <w:t xml:space="preserve">Authored and published a comprehensive enterprise deployment guide for FUAM (Fabric Unified Admin Monitoring) — an open-source Microsoft Fabric tenant monitoring solution. Covers Service Principal setup, pipeline orchestration, Azure Key Vault integration, governance configuration, and scheduling. Available on GitHub via the portfolio link above.</w:t>
+            </w:r>
+          </w:p>
+        </w:tc>
+      </w:tr>
+    </w:tbl>
+    <w:p>
+      <w:pPr>
+        <w:spacing w:after="0" w:before="40"/>
+      </w:pPr>
+    </w:p>
+    <w:tbl>
+      <w:tblPr>
+        <w:tblW w:type="dxa" w:w="9360"/>
+        <w:tblBorders>
+          <w:top w:val="single" w:color="auto" w:sz="4"/>
+          <w:left w:val="single" w:color="auto" w:sz="4"/>
+          <w:bottom w:val="single" w:color="auto" w:sz="4"/>
+          <w:right w:val="single" w:color="auto" w:sz="4"/>
+          <w:insideH w:val="single" w:color="auto" w:sz="4"/>
+          <w:insideV w:val="single" w:color="auto" w:sz="4"/>
+        </w:tblBorders>
+      </w:tblPr>
+      <w:tblGrid>
+        <w:gridCol w:w="9360"/>
+      </w:tblGrid>
+      <w:tr>
+        <w:tc>
+          <w:tcPr>
+            <w:tcW w:type="dxa" w:w="9360"/>
+            <w:tcBorders>
+              <w:top w:val="none" w:color="FFFFFF" w:sz="0"/>
+              <w:left w:val="single" w:color="E65100" w:sz="1"/>
+              <w:bottom w:val="none" w:color="FFFFFF" w:sz="0"/>
+              <w:right w:val="none" w:color="FFFFFF" w:sz="0"/>
+            </w:tcBorders>
+            <w:shd w:fill="FFF8E1" w:val="clear"/>
+            <w:tcMar>
+              <w:top w:type="dxa" w:w="100"/>
+              <w:left w:type="dxa" w:w="240"/>
+              <w:bottom w:type="dxa" w:w="100"/>
+              <w:right w:type="dxa" w:w="200"/>
+            </w:tcMar>
+          </w:tcPr>
+          <w:p>
+            <w:pPr>
+              <w:spacing w:after="30" w:before="0"/>
+            </w:pPr>
+            <w:r>
+              <w:rPr>
+                <w:rFonts w:ascii="Calibri" w:cs="Calibri" w:eastAsia="Calibri" w:hAnsi="Calibri"/>
+                <w:b/>
+                <w:bCs/>
+                <w:color w:val="00695C"/>
+                <w:sz w:val="20"/>
+                <w:szCs w:val="20"/>
+              </w:rPr>
+              <w:t xml:space="preserve">Technical Article Series  ·  6 Articles on Enterprise Power BI &amp; Fabric</w:t>
+            </w:r>
+            <w:r>
+              <w:rPr>
+                <w:rFonts w:ascii="Calibri" w:cs="Calibri" w:eastAsia="Calibri" w:hAnsi="Calibri"/>
+                <w:color w:val="616161"/>
+                <w:sz w:val="20"/>
+                <w:szCs w:val="20"/>
+              </w:rPr>
+              <w:t xml:space="preserve">  ·  </w:t>
+            </w:r>
+            <w:hyperlink w:history="1" r:id="rId9454izqjpnwlias4zkvnj">
+              <w:r>
+                <w:rPr>
+                  <w:rFonts w:ascii="Calibri" w:cs="Calibri" w:eastAsia="Calibri" w:hAnsi="Calibri"/>
+                  <w:color w:val="2E75B6"/>
+                  <w:sz w:val="20"/>
+                  <w:szCs w:val="20"/>
+                  <w:u w:val="single"/>
+                </w:rPr>
+                <w:t xml:space="preserve">Read at phang7.github.io/Portfolio</w:t>
+              </w:r>
+            </w:hyperlink>
+          </w:p>
+          <w:p>
+            <w:pPr>
+              <w:spacing w:after="0" w:before="0"/>
+            </w:pPr>
+            <w:r>
+              <w:rPr>
+                <w:rFonts w:ascii="Calibri" w:cs="Calibri" w:eastAsia="Calibri" w:hAnsi="Calibri"/>
+                <w:color w:val="424242"/>
+                <w:sz w:val="19"/>
+                <w:szCs w:val="19"/>
+              </w:rPr>
+              <w:t xml:space="preserve">Published practitioner-level articles drawn from 13 years of enterprise BI experience: (1) Why Most Fabric Migrations Fail · (2) Zero Throttling at Scale · (3) Governance Framework for 100+ Workspaces · (4) Persona-Based BI Architecture · (5) Direct Lake vs Import vs Live Connect · (6) FUAM Tenant Monitoring Deployment. Readable at portfolio.</w:t>
             </w:r>
           </w:p>
         </w:tc>
@@ -3513,7 +3415,7 @@
                 <w:sz w:val="19"/>
                 <w:szCs w:val="19"/>
               </w:rPr>
-              <w:t xml:space="preserve">TIBCO Spotfire Certified Professional &amp; Associate</w:t>
+              <w:t xml:space="preserve">TIBCO Spotfire Certified Professional</w:t>
             </w:r>
             <w:r>
               <w:rPr>
@@ -3768,7 +3670,7 @@
         <w:sz w:val="17"/>
         <w:szCs w:val="17"/>
       </w:rPr>
-      <w:t xml:space="preserve">	Power BI Architect · Microsoft Fabric · Enterprise BI Strategy</w:t>
+      <w:t xml:space="preserve">	Power BI Architect  ·  Microsoft Fabric  ·  Enterprise BI Strategy</w:t>
     </w:r>
   </w:p>
 </w:hdr>
@@ -3873,21 +3775,6 @@
       <w:rPr>
         <w:rFonts w:ascii="Calibri" w:cs="Calibri" w:eastAsia="Calibri" w:hAnsi="Calibri"/>
         <w:color w:val="2E75B6"/>
-        <w:sz w:val="18"/>
-        <w:szCs w:val="18"/>
-      </w:rPr>
-    </w:lvl>
-    <w:lvl w:ilvl="1" w15:tentative="1">
-      <w:start w:val="1"/>
-      <w:numFmt w:val="bullet"/>
-      <w:lvlText w:val="–"/>
-      <w:lvlJc w:val="left"/>
-      <w:pPr>
-        <w:ind w:left="900" w:hanging="300"/>
-      </w:pPr>
-      <w:rPr>
-        <w:rFonts w:ascii="Calibri" w:cs="Calibri" w:eastAsia="Calibri" w:hAnsi="Calibri"/>
-        <w:color w:val="616161"/>
         <w:sz w:val="18"/>
         <w:szCs w:val="18"/>
       </w:rPr>
@@ -4091,22 +3978,5 @@
       <w:szCs w:val="20"/>
     </w:rPr>
   </w:style>
-  <w:style w:type="paragraph" w:styleId="Heading1">
-    <w:name w:val="Heading 1"/>
-    <w:basedOn w:val="Normal"/>
-    <w:next w:val="Normal"/>
-    <w:pPr>
-      <w:spacing w:after="60" w:before="120"/>
-      <w:outlineLvl w:val="0"/>
-    </w:pPr>
-    <w:rPr>
-      <w:rFonts w:ascii="Calibri" w:cs="Calibri" w:eastAsia="Calibri" w:hAnsi="Calibri"/>
-      <w:b/>
-      <w:bCs/>
-      <w:color w:val="1F4E79"/>
-      <w:sz w:val="22"/>
-      <w:szCs w:val="22"/>
-    </w:rPr>
-  </w:style>
 </w:styles>
 </file>
</xml_diff>

<commit_message>
Update: all URLs to phanigaddam.com
</commit_message>
<xml_diff>
--- a/Phanindra_Gaddam_Resume_2025.docx
+++ b/Phanindra_Gaddam_Resume_2025.docx
@@ -79,7 +79,7 @@
               </w:rPr>
               <w:t xml:space="preserve">Wayne, NJ  ·  +1-907-351-7666  ·  </w:t>
             </w:r>
-            <w:hyperlink w:history="1" r:id="rIdupqvp1u3aby4cmf8t8kug">
+            <w:hyperlink w:history="1" r:id="rIdytpwnbexrv1gsamokrzlg">
               <w:r>
                 <w:rPr>
                   <w:rFonts w:ascii="Calibri" w:cs="Calibri" w:eastAsia="Calibri" w:hAnsi="Calibri"/>
@@ -100,7 +100,7 @@
               </w:rPr>
               <w:t xml:space="preserve">  ·  </w:t>
             </w:r>
-            <w:hyperlink w:history="1" r:id="rIdzcpyormzg9nn378yxjzeq">
+            <w:hyperlink w:history="1" r:id="rIdxwh7cfvhx4eph1mzyiwis">
               <w:r>
                 <w:rPr>
                   <w:rFonts w:ascii="Calibri" w:cs="Calibri" w:eastAsia="Calibri" w:hAnsi="Calibri"/>
@@ -121,7 +121,7 @@
               </w:rPr>
               <w:t xml:space="preserve">  ·  </w:t>
             </w:r>
-            <w:hyperlink w:history="1" r:id="rId-umne2dvqhyzozxc1l80b">
+            <w:hyperlink w:history="1" r:id="rIdcwr9srrpngwce4v1oyohf">
               <w:r>
                 <w:rPr>
                   <w:rFonts w:ascii="Calibri" w:cs="Calibri" w:eastAsia="Calibri" w:hAnsi="Calibri"/>
@@ -130,7 +130,7 @@
                   <w:szCs w:val="20"/>
                   <w:u w:val="single"/>
                 </w:rPr>
-                <w:t xml:space="preserve">Portfolio: phang7.github.io/Portfolio</w:t>
+                <w:t xml:space="preserve">Portfolio: phanigaddam.com</w:t>
               </w:r>
             </w:hyperlink>
           </w:p>
@@ -606,7 +606,7 @@
         </w:rPr>
         <w:t xml:space="preserve"> covering Fabric architecture, governance, performance optimisation, and Direct Lake strategy. All available at </w:t>
       </w:r>
-      <w:hyperlink w:history="1" r:id="rIdlhh3w3tqlcgim9jxgmp3p">
+      <w:hyperlink w:history="1" r:id="rIdtipx0mt6lylr1xvvxt-qh">
         <w:r>
           <w:rPr>
             <w:rFonts w:ascii="Calibri" w:cs="Calibri" w:eastAsia="Calibri" w:hAnsi="Calibri"/>
@@ -615,7 +615,7 @@
             <w:szCs w:val="20"/>
             <w:u w:val="single"/>
           </w:rPr>
-          <w:t xml:space="preserve">phang7.github.io/Portfolio</w:t>
+          <w:t xml:space="preserve">phanigaddam.com</w:t>
         </w:r>
       </w:hyperlink>
       <w:r>
@@ -2964,7 +2964,7 @@
               </w:rPr>
               <w:t xml:space="preserve">  ·  </w:t>
             </w:r>
-            <w:hyperlink w:history="1" r:id="rIdy4egd7pcb1lrerffaevwa">
+            <w:hyperlink w:history="1" r:id="rId8xj1tiwk2k58pb9mzkqlt">
               <w:r>
                 <w:rPr>
                   <w:rFonts w:ascii="Calibri" w:cs="Calibri" w:eastAsia="Calibri" w:hAnsi="Calibri"/>
@@ -2973,7 +2973,7 @@
                   <w:szCs w:val="20"/>
                   <w:u w:val="single"/>
                 </w:rPr>
-                <w:t xml:space="preserve">phang7.github.io/Portfolio</w:t>
+                <w:t xml:space="preserve">phanigaddam.com</w:t>
               </w:r>
             </w:hyperlink>
           </w:p>
@@ -3056,7 +3056,7 @@
               </w:rPr>
               <w:t xml:space="preserve">  ·  </w:t>
             </w:r>
-            <w:hyperlink w:history="1" r:id="rIdi0ml5k4ksa1if39be7nyl">
+            <w:hyperlink w:history="1" r:id="rIdarb14zwt-oya3etzylqke">
               <w:r>
                 <w:rPr>
                   <w:rFonts w:ascii="Calibri" w:cs="Calibri" w:eastAsia="Calibri" w:hAnsi="Calibri"/>
@@ -3148,7 +3148,7 @@
               </w:rPr>
               <w:t xml:space="preserve">  ·  </w:t>
             </w:r>
-            <w:hyperlink w:history="1" r:id="rId9454izqjpnwlias4zkvnj">
+            <w:hyperlink w:history="1" r:id="rIdy4ecpftdc78igfsmaqu-l">
               <w:r>
                 <w:rPr>
                   <w:rFonts w:ascii="Calibri" w:cs="Calibri" w:eastAsia="Calibri" w:hAnsi="Calibri"/>
@@ -3157,7 +3157,7 @@
                   <w:szCs w:val="20"/>
                   <w:u w:val="single"/>
                 </w:rPr>
-                <w:t xml:space="preserve">Read at phang7.github.io/Portfolio</w:t>
+                <w:t xml:space="preserve">Read at phanigaddam.com</w:t>
               </w:r>
             </w:hyperlink>
           </w:p>
@@ -3597,7 +3597,7 @@
         <w:sz w:val="16"/>
         <w:szCs w:val="16"/>
       </w:rPr>
-      <w:t xml:space="preserve">	phang7.github.io/Portfolio</w:t>
+      <w:t xml:space="preserve">	phanigaddam.com</w:t>
     </w:r>
   </w:p>
 </w:ftr>

</xml_diff>

<commit_message>
Revert: all URLs back to phang7.github.io/Portfolio, remove CNAME
</commit_message>
<xml_diff>
--- a/Phanindra_Gaddam_Resume_2025.docx
+++ b/Phanindra_Gaddam_Resume_2025.docx
@@ -79,7 +79,7 @@
               </w:rPr>
               <w:t xml:space="preserve">Wayne, NJ  ·  +1-907-351-7666  ·  </w:t>
             </w:r>
-            <w:hyperlink w:history="1" r:id="rIdytpwnbexrv1gsamokrzlg">
+            <w:hyperlink w:history="1" r:id="rIdfukyyb0w4isarnsmczyy-">
               <w:r>
                 <w:rPr>
                   <w:rFonts w:ascii="Calibri" w:cs="Calibri" w:eastAsia="Calibri" w:hAnsi="Calibri"/>
@@ -100,7 +100,7 @@
               </w:rPr>
               <w:t xml:space="preserve">  ·  </w:t>
             </w:r>
-            <w:hyperlink w:history="1" r:id="rIdxwh7cfvhx4eph1mzyiwis">
+            <w:hyperlink w:history="1" r:id="rIdw_1sdf4c31klfdcqkpdwd">
               <w:r>
                 <w:rPr>
                   <w:rFonts w:ascii="Calibri" w:cs="Calibri" w:eastAsia="Calibri" w:hAnsi="Calibri"/>
@@ -121,7 +121,7 @@
               </w:rPr>
               <w:t xml:space="preserve">  ·  </w:t>
             </w:r>
-            <w:hyperlink w:history="1" r:id="rIdcwr9srrpngwce4v1oyohf">
+            <w:hyperlink w:history="1" r:id="rIdz8onmcpmmc39olm7qxosy">
               <w:r>
                 <w:rPr>
                   <w:rFonts w:ascii="Calibri" w:cs="Calibri" w:eastAsia="Calibri" w:hAnsi="Calibri"/>
@@ -130,7 +130,7 @@
                   <w:szCs w:val="20"/>
                   <w:u w:val="single"/>
                 </w:rPr>
-                <w:t xml:space="preserve">Portfolio: phanigaddam.com</w:t>
+                <w:t xml:space="preserve">Portfolio: phang7.github.io/Portfolio</w:t>
               </w:r>
             </w:hyperlink>
           </w:p>
@@ -606,7 +606,7 @@
         </w:rPr>
         <w:t xml:space="preserve"> covering Fabric architecture, governance, performance optimisation, and Direct Lake strategy. All available at </w:t>
       </w:r>
-      <w:hyperlink w:history="1" r:id="rIdtipx0mt6lylr1xvvxt-qh">
+      <w:hyperlink w:history="1" r:id="rIdy4lmplns4fyxrnidjb7ot">
         <w:r>
           <w:rPr>
             <w:rFonts w:ascii="Calibri" w:cs="Calibri" w:eastAsia="Calibri" w:hAnsi="Calibri"/>
@@ -615,7 +615,7 @@
             <w:szCs w:val="20"/>
             <w:u w:val="single"/>
           </w:rPr>
-          <w:t xml:space="preserve">phanigaddam.com</w:t>
+          <w:t xml:space="preserve">phang7.github.io/Portfolio</w:t>
         </w:r>
       </w:hyperlink>
       <w:r>
@@ -2964,7 +2964,7 @@
               </w:rPr>
               <w:t xml:space="preserve">  ·  </w:t>
             </w:r>
-            <w:hyperlink w:history="1" r:id="rId8xj1tiwk2k58pb9mzkqlt">
+            <w:hyperlink w:history="1" r:id="rIdunmslww_xtpb4w9onfh4s">
               <w:r>
                 <w:rPr>
                   <w:rFonts w:ascii="Calibri" w:cs="Calibri" w:eastAsia="Calibri" w:hAnsi="Calibri"/>
@@ -2973,7 +2973,7 @@
                   <w:szCs w:val="20"/>
                   <w:u w:val="single"/>
                 </w:rPr>
-                <w:t xml:space="preserve">phanigaddam.com</w:t>
+                <w:t xml:space="preserve">phang7.github.io/Portfolio</w:t>
               </w:r>
             </w:hyperlink>
           </w:p>
@@ -3056,7 +3056,7 @@
               </w:rPr>
               <w:t xml:space="preserve">  ·  </w:t>
             </w:r>
-            <w:hyperlink w:history="1" r:id="rIdarb14zwt-oya3etzylqke">
+            <w:hyperlink w:history="1" r:id="rIdheu21vnnqaqxdkjavw5do">
               <w:r>
                 <w:rPr>
                   <w:rFonts w:ascii="Calibri" w:cs="Calibri" w:eastAsia="Calibri" w:hAnsi="Calibri"/>
@@ -3148,7 +3148,7 @@
               </w:rPr>
               <w:t xml:space="preserve">  ·  </w:t>
             </w:r>
-            <w:hyperlink w:history="1" r:id="rIdy4ecpftdc78igfsmaqu-l">
+            <w:hyperlink w:history="1" r:id="rIdvz7qmxe8kpuccmgv6mg-x">
               <w:r>
                 <w:rPr>
                   <w:rFonts w:ascii="Calibri" w:cs="Calibri" w:eastAsia="Calibri" w:hAnsi="Calibri"/>
@@ -3157,7 +3157,7 @@
                   <w:szCs w:val="20"/>
                   <w:u w:val="single"/>
                 </w:rPr>
-                <w:t xml:space="preserve">Read at phanigaddam.com</w:t>
+                <w:t xml:space="preserve">Read at phang7.github.io/Portfolio</w:t>
               </w:r>
             </w:hyperlink>
           </w:p>
@@ -3597,7 +3597,7 @@
         <w:sz w:val="16"/>
         <w:szCs w:val="16"/>
       </w:rPr>
-      <w:t xml:space="preserve">	phanigaddam.com</w:t>
+      <w:t xml:space="preserve">	phang7.github.io/Portfolio</w:t>
     </w:r>
   </w:p>
 </w:ftr>

</xml_diff>